<commit_message>
Remove duplicate headers from coursework figures
</commit_message>
<xml_diff>
--- a/08_Записка/Пояснительная_записка.docx
+++ b/08_Записка/Пояснительная_записка.docx
@@ -681,7 +681,7 @@
           <w:lang w:val="ru-RU"/>
         </w:rPr>
         <w:tab/>
-        <w:t>13</w:t>
+        <w:t>12</w:t>
       </w:r>
     </w:p>
     <w:p>
@@ -709,7 +709,7 @@
           <w:lang w:val="ru-RU"/>
         </w:rPr>
         <w:tab/>
-        <w:t>15</w:t>
+        <w:t>14</w:t>
       </w:r>
     </w:p>
     <w:p>
@@ -737,7 +737,7 @@
           <w:lang w:val="ru-RU"/>
         </w:rPr>
         <w:tab/>
-        <w:t>18</w:t>
+        <w:t>17</w:t>
       </w:r>
     </w:p>
     <w:p>
@@ -765,7 +765,7 @@
           <w:lang w:val="ru-RU"/>
         </w:rPr>
         <w:tab/>
-        <w:t>20</w:t>
+        <w:t>19</w:t>
       </w:r>
     </w:p>
     <w:p>
@@ -793,7 +793,7 @@
           <w:lang w:val="ru-RU"/>
         </w:rPr>
         <w:tab/>
-        <w:t>21</w:t>
+        <w:t>20</w:t>
       </w:r>
     </w:p>
     <w:p>
@@ -821,7 +821,7 @@
           <w:lang w:val="ru-RU"/>
         </w:rPr>
         <w:tab/>
-        <w:t>22</w:t>
+        <w:t>21</w:t>
       </w:r>
     </w:p>
     <w:p>
@@ -849,7 +849,7 @@
           <w:lang w:val="ru-RU"/>
         </w:rPr>
         <w:tab/>
-        <w:t>23</w:t>
+        <w:t>22</w:t>
       </w:r>
     </w:p>
     <w:p>
@@ -877,7 +877,7 @@
           <w:lang w:val="ru-RU"/>
         </w:rPr>
         <w:tab/>
-        <w:t>27</w:t>
+        <w:t>26</w:t>
       </w:r>
     </w:p>
     <w:p>
@@ -905,7 +905,7 @@
           <w:lang w:val="ru-RU"/>
         </w:rPr>
         <w:tab/>
-        <w:t>28</w:t>
+        <w:t>27</w:t>
       </w:r>
     </w:p>
     <w:p>
@@ -933,7 +933,7 @@
           <w:lang w:val="ru-RU"/>
         </w:rPr>
         <w:tab/>
-        <w:t>29</w:t>
+        <w:t>28</w:t>
       </w:r>
     </w:p>
     <w:p>
@@ -961,7 +961,7 @@
           <w:lang w:val="ru-RU"/>
         </w:rPr>
         <w:tab/>
-        <w:t>30</w:t>
+        <w:t>29</w:t>
       </w:r>
     </w:p>
     <w:p>
@@ -989,7 +989,7 @@
           <w:lang w:val="ru-RU"/>
         </w:rPr>
         <w:tab/>
-        <w:t>31</w:t>
+        <w:t>30</w:t>
       </w:r>
     </w:p>
     <w:p>
@@ -1474,7 +1474,7 @@
       <w:r>
         <w:drawing>
           <wp:inline xmlns:a="http://schemas.openxmlformats.org/drawingml/2006/main" xmlns:pic="http://schemas.openxmlformats.org/drawingml/2006/picture">
-            <wp:extent cx="6300470" cy="2931795"/>
+            <wp:extent cx="6300470" cy="2975519"/>
             <wp:docPr id="2" name="Picture 2"/>
             <wp:cNvGraphicFramePr>
               <a:graphicFrameLocks noChangeAspect="1"/>
@@ -1495,7 +1495,7 @@
                   <pic:spPr>
                     <a:xfrm>
                       <a:off x="0" y="0"/>
-                      <a:ext cx="6300470" cy="2931795"/>
+                      <a:ext cx="6300470" cy="2975519"/>
                     </a:xfrm>
                     <a:prstGeom prst="rect"/>
                   </pic:spPr>
@@ -1741,7 +1741,7 @@
       <w:r>
         <w:drawing>
           <wp:inline xmlns:a="http://schemas.openxmlformats.org/drawingml/2006/main" xmlns:pic="http://schemas.openxmlformats.org/drawingml/2006/picture">
-            <wp:extent cx="6300470" cy="4211604"/>
+            <wp:extent cx="6300470" cy="3711860"/>
             <wp:docPr id="3" name="Picture 3"/>
             <wp:cNvGraphicFramePr>
               <a:graphicFrameLocks noChangeAspect="1"/>
@@ -1762,7 +1762,7 @@
                   <pic:spPr>
                     <a:xfrm>
                       <a:off x="0" y="0"/>
-                      <a:ext cx="6300470" cy="4211604"/>
+                      <a:ext cx="6300470" cy="3711860"/>
                     </a:xfrm>
                     <a:prstGeom prst="rect"/>
                   </pic:spPr>
@@ -3137,7 +3137,7 @@
       <w:r>
         <w:drawing>
           <wp:inline xmlns:a="http://schemas.openxmlformats.org/drawingml/2006/main" xmlns:pic="http://schemas.openxmlformats.org/drawingml/2006/picture">
-            <wp:extent cx="6300470" cy="3849162"/>
+            <wp:extent cx="6300470" cy="3331951"/>
             <wp:docPr id="4" name="Picture 4"/>
             <wp:cNvGraphicFramePr>
               <a:graphicFrameLocks noChangeAspect="1"/>
@@ -3158,7 +3158,7 @@
                   <pic:spPr>
                     <a:xfrm>
                       <a:off x="0" y="0"/>
-                      <a:ext cx="6300470" cy="3849162"/>
+                      <a:ext cx="6300470" cy="3331951"/>
                     </a:xfrm>
                     <a:prstGeom prst="rect"/>
                   </pic:spPr>
@@ -3195,7 +3195,7 @@
       <w:r>
         <w:drawing>
           <wp:inline xmlns:a="http://schemas.openxmlformats.org/drawingml/2006/main" xmlns:pic="http://schemas.openxmlformats.org/drawingml/2006/picture">
-            <wp:extent cx="6300470" cy="3745592"/>
+            <wp:extent cx="6300470" cy="3452054"/>
             <wp:docPr id="5" name="Picture 5"/>
             <wp:cNvGraphicFramePr>
               <a:graphicFrameLocks noChangeAspect="1"/>
@@ -3216,7 +3216,7 @@
                   <pic:spPr>
                     <a:xfrm>
                       <a:off x="0" y="0"/>
-                      <a:ext cx="6300470" cy="3745592"/>
+                      <a:ext cx="6300470" cy="3452054"/>
                     </a:xfrm>
                     <a:prstGeom prst="rect"/>
                   </pic:spPr>
@@ -3377,7 +3377,7 @@
       <w:r>
         <w:drawing>
           <wp:inline xmlns:a="http://schemas.openxmlformats.org/drawingml/2006/main" xmlns:pic="http://schemas.openxmlformats.org/drawingml/2006/picture">
-            <wp:extent cx="6300470" cy="4280898"/>
+            <wp:extent cx="6300470" cy="3915053"/>
             <wp:docPr id="7" name="Picture 7"/>
             <wp:cNvGraphicFramePr>
               <a:graphicFrameLocks noChangeAspect="1"/>
@@ -3398,7 +3398,7 @@
                   <pic:spPr>
                     <a:xfrm>
                       <a:off x="0" y="0"/>
-                      <a:ext cx="6300470" cy="4280898"/>
+                      <a:ext cx="6300470" cy="3915053"/>
                     </a:xfrm>
                     <a:prstGeom prst="rect"/>
                   </pic:spPr>
@@ -4272,7 +4272,7 @@
       <w:r>
         <w:drawing>
           <wp:inline xmlns:a="http://schemas.openxmlformats.org/drawingml/2006/main" xmlns:pic="http://schemas.openxmlformats.org/drawingml/2006/picture">
-            <wp:extent cx="6300470" cy="3910427"/>
+            <wp:extent cx="6300470" cy="3474306"/>
             <wp:docPr id="8" name="Picture 8"/>
             <wp:cNvGraphicFramePr>
               <a:graphicFrameLocks noChangeAspect="1"/>
@@ -4293,7 +4293,7 @@
                   <pic:spPr>
                     <a:xfrm>
                       <a:off x="0" y="0"/>
-                      <a:ext cx="6300470" cy="3910427"/>
+                      <a:ext cx="6300470" cy="3474306"/>
                     </a:xfrm>
                     <a:prstGeom prst="rect"/>
                   </pic:spPr>
@@ -5038,7 +5038,7 @@
       <w:r>
         <w:drawing>
           <wp:inline xmlns:a="http://schemas.openxmlformats.org/drawingml/2006/main" xmlns:pic="http://schemas.openxmlformats.org/drawingml/2006/picture">
-            <wp:extent cx="6300470" cy="3719835"/>
+            <wp:extent cx="6300470" cy="3557092"/>
             <wp:docPr id="9" name="Picture 9"/>
             <wp:cNvGraphicFramePr>
               <a:graphicFrameLocks noChangeAspect="1"/>
@@ -5059,7 +5059,7 @@
                   <pic:spPr>
                     <a:xfrm>
                       <a:off x="0" y="0"/>
-                      <a:ext cx="6300470" cy="3719835"/>
+                      <a:ext cx="6300470" cy="3557092"/>
                     </a:xfrm>
                     <a:prstGeom prst="rect"/>
                   </pic:spPr>
@@ -5452,7 +5452,7 @@
       <w:r>
         <w:drawing>
           <wp:inline xmlns:a="http://schemas.openxmlformats.org/drawingml/2006/main" xmlns:pic="http://schemas.openxmlformats.org/drawingml/2006/picture">
-            <wp:extent cx="6300470" cy="3893549"/>
+            <wp:extent cx="6300470" cy="3487830"/>
             <wp:docPr id="11" name="Picture 11"/>
             <wp:cNvGraphicFramePr>
               <a:graphicFrameLocks noChangeAspect="1"/>
@@ -5473,7 +5473,7 @@
                   <pic:spPr>
                     <a:xfrm>
                       <a:off x="0" y="0"/>
-                      <a:ext cx="6300470" cy="3893549"/>
+                      <a:ext cx="6300470" cy="3487830"/>
                     </a:xfrm>
                     <a:prstGeom prst="rect"/>
                   </pic:spPr>

</xml_diff>